<commit_message>
Restore combined report sections with verdicts and add team lead guide
</commit_message>
<xml_diff>
--- a/docs/Инструкция_менеджеру_Averon.docx
+++ b/docs/Инструкция_менеджеру_Averon.docx
@@ -95,7 +95,7 @@
         <w:pStyle w:val="Normal"/>
       </w:pPr>
       <w:r>
-        <w:t>Обычный разбор приходит одним сообщением. В заголовке — менеджер, дата, длительность, номер звонка и скрытый номер клиента с последними четырьмя цифрами. Затем — итог разговора, оценка качества, до двух сильных действий, до трёх важных упущений и конкретные действия для следующего разговора.</w:t>
+        <w:t>Обычный разбор приходит одним сообщением. В заголовке — менеджер, дата, длительность, полный номер клиента. Далее — 🎯 Итог звонка, 📊 Оценка звонка, ✅ Что получилось, 📌 Главный упущенный момент, 💬 Что изменить, 🎯 Что сделать дальше и 👤 Руководителю. При недостатке данных отдельные разделы могут отсутствовать.</w:t>
       </w:r>
     </w:p>
     <w:p>
@@ -111,7 +111,7 @@
         <w:pStyle w:val="Normal"/>
       </w:pPr>
       <w:r>
-        <w:t>Оценка 0–100 описывает выполнение применимых критериев действующей шкалы. Она не равна вероятности продажи. Отказ клиента и плохая работа менеджера — разные вещи. При обрывочной записи бот сообщает, что данных мало. Дополнительная проверка учитывает этап продажи, но не прибавляет свой результат к основному баллу.</w:t>
+        <w:t>Балл 0–100 описывает выполнение применимых критериев действующей шкалы. Знаки ✅, ⚠️ и ❌ учитывают достигнутый результат и ключевые упущения; они не являются диапазонами балла. Галочка не означает отсутствие ошибок. Балл не равен вероятности продажи. Отказ клиента и плохая работа менеджера — разные вещи. При обрывочной записи бот сообщает, что данных мало. Дополнительная проверка учитывает этап продажи, но не прибавляет свой результат к основному баллу.</w:t>
       </w:r>
     </w:p>
     <w:p>

</xml_diff>